<commit_message>
E03 v11: revert non-dialogue edits, keep only VOICE text changes
Co-Authored-By: Claude Sonnet 5.5 <noreply@anthropic.com>
Claude-Session: https://claude.ai/code/session_017SBzhjS3N4zHbxzjX63xLB
</commit_message>
<xml_diff>
--- a/E03_Robbed_a_Pharaoh_FINAL_v11.docx
+++ b/E03_Robbed_a_Pharaoh_FINAL_v11.docx
@@ -2511,7 +2511,7 @@
                 <w:rFonts w:ascii="Calibri" w:hAnsi="Calibri" w:cs="Calibri"/>
                 <w:sz w:val="19"/>
               </w:rPr>
-              <w:t>The oath and the stick</w:t>
+              <w:t>The stick</w:t>
             </w:r>
           </w:p>
         </w:tc>
@@ -2752,7 +2752,7 @@
                 <w:rFonts w:ascii="Calibri" w:hAnsi="Calibri" w:cs="Calibri"/>
                 <w:sz w:val="19"/>
               </w:rPr>
-              <w:t>Alone in the cell — the record stops</w:t>
+              <w:t>Alone in the cell — the oath</w:t>
             </w:r>
           </w:p>
         </w:tc>
@@ -6529,7 +6529,7 @@
           <w:rFonts w:ascii="Georgia" w:hAnsi="Georgia" w:cs="Georgia"/>
           <w:sz w:val="22"/>
         </w:rPr>
-        <w:t>SFX (LOUD, crisp, close-miked and punchy, clearly heard over the voice, never buried; each sound lands exactly with its action): 2s torch whoosh into the hole; 5s stones crashing inside; 8s a low hollow rumble as the dust settles.</w:t>
+        <w:t>SFX (LOUD, crisp, close-miked and punchy, clearly heard over the voice, never buried; each sound lands exactly with its action): 2s torch whoosh into the hole; 5s stones crashing inside; 8s sharp gasp.</w:t>
         <w:br/>
       </w:r>
       <w:r>
@@ -7167,7 +7167,7 @@
           <w:color w:val="3B3B3B"/>
           <w:sz w:val="26"/>
         </w:rPr>
-        <w:t>N09 · The oath and the stick  (9 s · starts 3:36)</w:t>
+        <w:t>N09 · The stick  (9 s · starts 3:36)</w:t>
       </w:r>
     </w:p>
     <w:p>
@@ -7550,7 +7550,7 @@
           <w:rFonts w:ascii="Georgia" w:hAnsi="Georgia" w:cs="Georgia"/>
           <w:sz w:val="22"/>
         </w:rPr>
-        <w:t>SCENE: West bank necropolis at night, torchlight only. The man from Image 1, hands tied, escorted by the guards from Image 2 toward the pyramid from Image 3.</w:t>
+        <w:t>SCENE: West bank necropolis, bright morning. The man from Image 1, hands tied, escorted by the guards from Image 2 toward the pyramid from Image 3.</w:t>
         <w:br/>
       </w:r>
       <w:r>
@@ -7589,7 +7589,7 @@
           <w:rFonts w:ascii="Georgia" w:hAnsi="Georgia" w:cs="Georgia"/>
           <w:sz w:val="22"/>
         </w:rPr>
-        <w:t>Ambience: desert night wind, distant dog. Rich and clearly audible under the entire scene, never drops out between sentences.</w:t>
+        <w:t>Ambience: desert wind, distant birds. Rich and clearly audible under the entire scene, never drops out between sentences.</w:t>
         <w:br/>
       </w:r>
       <w:r>
@@ -7736,7 +7736,7 @@
           <w:color w:val="3B3B3B"/>
           <w:sz w:val="26"/>
         </w:rPr>
-        <w:t>N10b · Alone in the cell — the record stops  (12 s · starts 4:07)</w:t>
+        <w:t>N10b · Alone in the cell — the oath  (12 s · starts 4:07)</w:t>
       </w:r>
     </w:p>
     <w:p>

</xml_diff>